<commit_message>
v3.2.2: honest /cco-update + dependency hygiene
/cco-update reframed as verifier-only:
- Discovered post-3.2.1 that Claude cannot invoke built-in slash-commands
  (/plugin marketplace update, /plugin update) from a custom slash-command.
- Command now reads installed version, local marketplace HEAD, GitHub remote;
  produces comparison table; tells user the exact commands to run if out of
  date. No more pretending to be a one-step shortcut.

CI:
- actions/checkout bumped v4 -> v5 (silences Node 20 deprecation warning).

Hygiene:
- .gitignore: added .claude/ (local Claude Code session state, distinct from
  plugin's .claude-plugin/ which remains committed).
</commit_message>
<xml_diff>
--- a/docs/REQUIREMENTS_SPEC.docx
+++ b/docs/REQUIREMENTS_SPEC.docx
@@ -43,7 +43,7 @@
         <w:pStyle w:val="FirstParagraph"/>
       </w:pPr>
       <w:r>
-        <w:t xml:space="preserve">Version 3.2.1 · Updated 2026-05-24 · Author: Valverde · Supersedes</w:t>
+        <w:t xml:space="preserve">Version 3.2.2 · Updated 2026-05-24 · Author: Valverde · Supersedes</w:t>
       </w:r>
       <w:r>
         <w:t xml:space="preserve"> </w:t>
@@ -61,7 +61,199 @@
         <w:t xml:space="preserve"> </w:t>
       </w:r>
       <w:r>
-        <w:t xml:space="preserve">+ v1, v2, v3.0, v3.1, v3.2.0 of this spec</w:t>
+        <w:t xml:space="preserve">+ v1, v2, v3.0, v3.1, v3.2.0, v3.2.1 of this spec</w:t>
+      </w:r>
+    </w:p>
+    <w:p>
+      <w:pPr>
+        <w:pStyle w:val="BodyText"/>
+      </w:pPr>
+      <w:r>
+        <w:rPr>
+          <w:b/>
+        </w:rPr>
+        <w:t xml:space="preserve">v3.2.2 changes summary (post-3.2.1 honesty + dependency hygiene):</w:t>
+      </w:r>
+      <w:r>
+        <w:t xml:space="preserve"> </w:t>
+      </w:r>
+      <w:r>
+        <w:t xml:space="preserve">-</w:t>
+      </w:r>
+      <w:r>
+        <w:t xml:space="preserve"> </w:t>
+      </w:r>
+      <w:r>
+        <w:rPr>
+          <w:rStyle w:val="VerbatimChar"/>
+          <w:b/>
+        </w:rPr>
+        <w:t xml:space="preserve">/cco-update</w:t>
+      </w:r>
+      <w:r>
+        <w:rPr>
+          <w:b/>
+        </w:rPr>
+        <w:t xml:space="preserve"> </w:t>
+      </w:r>
+      <w:r>
+        <w:rPr>
+          <w:b/>
+        </w:rPr>
+        <w:t xml:space="preserve">reframed as verifier-only.</w:t>
+      </w:r>
+      <w:r>
+        <w:t xml:space="preserve"> </w:t>
+      </w:r>
+      <w:r>
+        <w:t xml:space="preserve">Discovered after shipping v3.2.1 that Claude cannot programmatically invoke Claude Code’s built-in slash-commands (</w:t>
+      </w:r>
+      <w:r>
+        <w:rPr>
+          <w:rStyle w:val="VerbatimChar"/>
+        </w:rPr>
+        <w:t xml:space="preserve">/plugin marketplace update</w:t>
+      </w:r>
+      <w:r>
+        <w:t xml:space="preserve">,</w:t>
+      </w:r>
+      <w:r>
+        <w:t xml:space="preserve"> </w:t>
+      </w:r>
+      <w:r>
+        <w:rPr>
+          <w:rStyle w:val="VerbatimChar"/>
+        </w:rPr>
+        <w:t xml:space="preserve">/plugin update</w:t>
+      </w:r>
+      <w:r>
+        <w:t xml:space="preserve">) from inside a custom slash-command. The command now honestly describes what it does: read the installed plugin version, the local marketplace HEAD, and the GitHub remote; produce a comparison table; and tell the user the exact commands to run if out of date. No more pretending to be a one-step shortcut. The verification report it produces is still useful (Claude confirms three pointers align).</w:t>
+      </w:r>
+      <w:r>
+        <w:t xml:space="preserve"> </w:t>
+      </w:r>
+      <w:r>
+        <w:t xml:space="preserve">-</w:t>
+      </w:r>
+      <w:r>
+        <w:t xml:space="preserve"> </w:t>
+      </w:r>
+      <w:r>
+        <w:rPr>
+          <w:b/>
+        </w:rPr>
+        <w:t xml:space="preserve">CI:</w:t>
+      </w:r>
+      <w:r>
+        <w:rPr>
+          <w:b/>
+        </w:rPr>
+        <w:t xml:space="preserve"> </w:t>
+      </w:r>
+      <w:r>
+        <w:rPr>
+          <w:rStyle w:val="VerbatimChar"/>
+          <w:b/>
+        </w:rPr>
+        <w:t xml:space="preserve">actions/checkout</w:t>
+      </w:r>
+      <w:r>
+        <w:rPr>
+          <w:b/>
+        </w:rPr>
+        <w:t xml:space="preserve"> </w:t>
+      </w:r>
+      <w:r>
+        <w:rPr>
+          <w:b/>
+        </w:rPr>
+        <w:t xml:space="preserve">bumped v4 → v5</w:t>
+      </w:r>
+      <w:r>
+        <w:t xml:space="preserve"> </w:t>
+      </w:r>
+      <w:r>
+        <w:t xml:space="preserve">in</w:t>
+      </w:r>
+      <w:r>
+        <w:t xml:space="preserve"> </w:t>
+      </w:r>
+      <w:r>
+        <w:rPr>
+          <w:rStyle w:val="VerbatimChar"/>
+        </w:rPr>
+        <w:t xml:space="preserve">.github/workflows/auto-tag.yml</w:t>
+      </w:r>
+      <w:r>
+        <w:t xml:space="preserve">. Silences the Node 20 deprecation warning. No functional change.</w:t>
+      </w:r>
+      <w:r>
+        <w:t xml:space="preserve"> </w:t>
+      </w:r>
+      <w:r>
+        <w:t xml:space="preserve">-</w:t>
+      </w:r>
+      <w:r>
+        <w:t xml:space="preserve"> </w:t>
+      </w:r>
+      <w:r>
+        <w:rPr>
+          <w:rStyle w:val="VerbatimChar"/>
+          <w:b/>
+        </w:rPr>
+        <w:t xml:space="preserve">.gitignore</w:t>
+      </w:r>
+      <w:r>
+        <w:rPr>
+          <w:b/>
+        </w:rPr>
+        <w:t xml:space="preserve">: added</w:t>
+      </w:r>
+      <w:r>
+        <w:rPr>
+          <w:b/>
+        </w:rPr>
+        <w:t xml:space="preserve"> </w:t>
+      </w:r>
+      <w:r>
+        <w:rPr>
+          <w:rStyle w:val="VerbatimChar"/>
+          <w:b/>
+        </w:rPr>
+        <w:t xml:space="preserve">.claude/</w:t>
+      </w:r>
+      <w:r>
+        <w:t xml:space="preserve"> </w:t>
+      </w:r>
+      <w:r>
+        <w:t xml:space="preserve">— local Claude Code session state (</w:t>
+      </w:r>
+      <w:r>
+        <w:rPr>
+          <w:rStyle w:val="VerbatimChar"/>
+        </w:rPr>
+        <w:t xml:space="preserve">settings.local.json</w:t>
+      </w:r>
+      <w:r>
+        <w:t xml:space="preserve"> </w:t>
+      </w:r>
+      <w:r>
+        <w:t xml:space="preserve">etc.) that appears when this repo is opened in Claude Code. Distinct from the plugin’s</w:t>
+      </w:r>
+      <w:r>
+        <w:t xml:space="preserve"> </w:t>
+      </w:r>
+      <w:r>
+        <w:rPr>
+          <w:rStyle w:val="VerbatimChar"/>
+        </w:rPr>
+        <w:t xml:space="preserve">.claude-plugin/</w:t>
+      </w:r>
+      <w:r>
+        <w:t xml:space="preserve"> </w:t>
+      </w:r>
+      <w:r>
+        <w:t xml:space="preserve">(which is and should remain committed).</w:t>
       </w:r>
     </w:p>
     <w:p>

</xml_diff>